<commit_message>
Update Hardik Saini resume files
Replace the DOCX and PDF versions of Hardik Saini's resume with updated binaries. The diff is binary so content changes aren't shown here; this commit updates the resume assets to the latest version.
</commit_message>
<xml_diff>
--- a/Hardik Saini Resume.docx
+++ b/Hardik Saini Resume.docx
@@ -320,7 +320,6 @@
           <w:szCs w:val="18"/>
         </w:rPr>
       </w:pPr>
-      <w:proofErr w:type="gramStart"/>
       <w:r>
         <w:rPr>
           <w:b/>
@@ -331,7 +330,6 @@
         </w:rPr>
         <w:t>Certifications :</w:t>
       </w:r>
-      <w:proofErr w:type="gramEnd"/>
       <w:r>
         <w:t xml:space="preserve"> </w:t>
       </w:r>
@@ -349,18 +347,8 @@
           <w:sz w:val="18"/>
           <w:szCs w:val="18"/>
         </w:rPr>
-        <w:t xml:space="preserve"> | </w:t>
-      </w:r>
-      <w:proofErr w:type="spellStart"/>
-      <w:r>
-        <w:rPr>
-          <w:color w:val="000000" w:themeColor="text1"/>
-          <w:sz w:val="18"/>
-          <w:szCs w:val="18"/>
-        </w:rPr>
-        <w:t>CodePath</w:t>
-      </w:r>
-      <w:proofErr w:type="spellEnd"/>
+        <w:t xml:space="preserve"> | CodePath</w:t>
+      </w:r>
       <w:r>
         <w:rPr>
           <w:color w:val="000000" w:themeColor="text1"/>
@@ -421,44 +409,26 @@
           <w:sz w:val="18"/>
           <w:szCs w:val="18"/>
         </w:rPr>
+        <w:t xml:space="preserve"> Slurm, Kubernetes</w:t>
+      </w:r>
+      <w:r>
+        <w:rPr>
+          <w:color w:val="000000" w:themeColor="text1"/>
+          <w:sz w:val="18"/>
+          <w:szCs w:val="18"/>
+        </w:rPr>
+        <w:t xml:space="preserve"> Unix Operability,</w:t>
+      </w:r>
+      <w:r>
+        <w:rPr>
+          <w:b/>
+          <w:bCs/>
+          <w:color w:val="000000" w:themeColor="text1"/>
+          <w:sz w:val="18"/>
+          <w:szCs w:val="18"/>
+        </w:rPr>
         <w:t xml:space="preserve"> </w:t>
       </w:r>
-      <w:proofErr w:type="spellStart"/>
-      <w:r>
-        <w:rPr>
-          <w:color w:val="000000" w:themeColor="text1"/>
-          <w:sz w:val="18"/>
-          <w:szCs w:val="18"/>
-        </w:rPr>
-        <w:t>Slurm</w:t>
-      </w:r>
-      <w:proofErr w:type="spellEnd"/>
-      <w:r>
-        <w:rPr>
-          <w:color w:val="000000" w:themeColor="text1"/>
-          <w:sz w:val="18"/>
-          <w:szCs w:val="18"/>
-        </w:rPr>
-        <w:t>, Kubernetes</w:t>
-      </w:r>
-      <w:r>
-        <w:rPr>
-          <w:color w:val="000000" w:themeColor="text1"/>
-          <w:sz w:val="18"/>
-          <w:szCs w:val="18"/>
-        </w:rPr>
-        <w:t xml:space="preserve"> Unix Operability,</w:t>
-      </w:r>
-      <w:r>
-        <w:rPr>
-          <w:b/>
-          <w:bCs/>
-          <w:color w:val="000000" w:themeColor="text1"/>
-          <w:sz w:val="18"/>
-          <w:szCs w:val="18"/>
-        </w:rPr>
-        <w:t xml:space="preserve"> </w:t>
-      </w:r>
       <w:r>
         <w:rPr>
           <w:color w:val="000000" w:themeColor="text1"/>
@@ -507,51 +477,15 @@
           <w:sz w:val="18"/>
           <w:szCs w:val="18"/>
         </w:rPr>
-        <w:t xml:space="preserve"> Programming Languages proficiency (</w:t>
-      </w:r>
-      <w:proofErr w:type="gramStart"/>
-      <w:r>
-        <w:rPr>
-          <w:color w:val="000000" w:themeColor="text1"/>
-          <w:sz w:val="18"/>
-          <w:szCs w:val="18"/>
-        </w:rPr>
-        <w:t>Python ,C</w:t>
-      </w:r>
-      <w:proofErr w:type="gramEnd"/>
-      <w:r>
-        <w:rPr>
-          <w:color w:val="000000" w:themeColor="text1"/>
-          <w:sz w:val="18"/>
-          <w:szCs w:val="18"/>
-        </w:rPr>
-        <w:t xml:space="preserve"> , Java), Technology Integration, Office 365 SharePoint Administration, System Troubleshooting, Hardware </w:t>
-      </w:r>
-      <w:proofErr w:type="gramStart"/>
-      <w:r>
-        <w:rPr>
-          <w:color w:val="000000" w:themeColor="text1"/>
-          <w:sz w:val="18"/>
-          <w:szCs w:val="18"/>
-        </w:rPr>
-        <w:t>Configuration</w:t>
-      </w:r>
-      <w:r>
-        <w:rPr>
-          <w:color w:val="000000" w:themeColor="text1"/>
-          <w:sz w:val="18"/>
-          <w:szCs w:val="18"/>
-        </w:rPr>
-        <w:t xml:space="preserve"> ,</w:t>
-      </w:r>
-      <w:proofErr w:type="gramEnd"/>
-      <w:r>
-        <w:rPr>
-          <w:color w:val="000000" w:themeColor="text1"/>
-          <w:sz w:val="18"/>
-          <w:szCs w:val="18"/>
-        </w:rPr>
-        <w:t xml:space="preserve"> Basic CI/CD.</w:t>
+        <w:t xml:space="preserve"> Programming Languages proficiency (Python ,C , Java), Technology Integration, Office 365 SharePoint Administration, System Troubleshooting, Hardware Configuration</w:t>
+      </w:r>
+      <w:r>
+        <w:rPr>
+          <w:color w:val="000000" w:themeColor="text1"/>
+          <w:sz w:val="18"/>
+          <w:szCs w:val="18"/>
+        </w:rPr>
+        <w:t xml:space="preserve"> , Basic CI/CD.</w:t>
       </w:r>
     </w:p>
     <w:p>
@@ -580,43 +514,7 @@
           <w:sz w:val="18"/>
           <w:szCs w:val="18"/>
         </w:rPr>
-        <w:t xml:space="preserve">: Initiative and Problem Solving, Technical Troubleshooting, Team </w:t>
-      </w:r>
-      <w:proofErr w:type="gramStart"/>
-      <w:r>
-        <w:rPr>
-          <w:color w:val="000000" w:themeColor="text1"/>
-          <w:sz w:val="18"/>
-          <w:szCs w:val="18"/>
-        </w:rPr>
-        <w:t>Collaboration ,</w:t>
-      </w:r>
-      <w:proofErr w:type="gramEnd"/>
-      <w:r>
-        <w:rPr>
-          <w:color w:val="000000" w:themeColor="text1"/>
-          <w:sz w:val="18"/>
-          <w:szCs w:val="18"/>
-        </w:rPr>
-        <w:t xml:space="preserve"> User Support and </w:t>
-      </w:r>
-      <w:proofErr w:type="gramStart"/>
-      <w:r>
-        <w:rPr>
-          <w:color w:val="000000" w:themeColor="text1"/>
-          <w:sz w:val="18"/>
-          <w:szCs w:val="18"/>
-        </w:rPr>
-        <w:t>Training ,</w:t>
-      </w:r>
-      <w:proofErr w:type="gramEnd"/>
-      <w:r>
-        <w:rPr>
-          <w:color w:val="000000" w:themeColor="text1"/>
-          <w:sz w:val="18"/>
-          <w:szCs w:val="18"/>
-        </w:rPr>
-        <w:t xml:space="preserve"> Process Optimization</w:t>
+        <w:t>: Initiative and Problem Solving, Technical Troubleshooting, Team Collaboration , User Support and Training , Process Optimization</w:t>
       </w:r>
     </w:p>
     <w:p>
@@ -662,19 +560,8 @@
           <w:sz w:val="18"/>
           <w:szCs w:val="18"/>
         </w:rPr>
-        <w:t xml:space="preserve">Computer Networks, Infrastructure System </w:t>
-      </w:r>
-      <w:proofErr w:type="gramStart"/>
-      <w:r>
-        <w:rPr>
-          <w:b/>
-          <w:bCs/>
-          <w:sz w:val="18"/>
-          <w:szCs w:val="18"/>
-        </w:rPr>
-        <w:t>Design ,</w:t>
-      </w:r>
-      <w:proofErr w:type="gramEnd"/>
+        <w:t>Computer Networks, Infrastructure System Design ,</w:t>
+      </w:r>
       <w:r>
         <w:rPr>
           <w:b/>
@@ -689,56 +576,16 @@
           <w:sz w:val="18"/>
           <w:szCs w:val="18"/>
         </w:rPr>
-        <w:t xml:space="preserve">Software </w:t>
-      </w:r>
-      <w:proofErr w:type="gramStart"/>
-      <w:r>
-        <w:rPr>
-          <w:b/>
-          <w:bCs/>
-          <w:sz w:val="18"/>
-          <w:szCs w:val="18"/>
-        </w:rPr>
-        <w:t>Engineering ,</w:t>
-      </w:r>
-      <w:r>
-        <w:rPr>
-          <w:b/>
-          <w:bCs/>
-          <w:sz w:val="18"/>
-          <w:szCs w:val="18"/>
-        </w:rPr>
-        <w:t>Machine</w:t>
-      </w:r>
-      <w:proofErr w:type="gramEnd"/>
-      <w:r>
-        <w:rPr>
-          <w:b/>
-          <w:bCs/>
-          <w:sz w:val="18"/>
-          <w:szCs w:val="18"/>
-        </w:rPr>
-        <w:t xml:space="preserve"> </w:t>
-      </w:r>
-      <w:proofErr w:type="gramStart"/>
-      <w:r>
-        <w:rPr>
-          <w:b/>
-          <w:bCs/>
-          <w:sz w:val="18"/>
-          <w:szCs w:val="18"/>
-        </w:rPr>
-        <w:t>Learning ,Design</w:t>
-      </w:r>
-      <w:proofErr w:type="gramEnd"/>
-      <w:r>
-        <w:rPr>
-          <w:b/>
-          <w:bCs/>
-          <w:sz w:val="18"/>
-          <w:szCs w:val="18"/>
-        </w:rPr>
-        <w:t xml:space="preserve"> Analysis &amp; Algorithms, Operating Systems, Software Development, Data Structures, Computer Organization,</w:t>
+        <w:t>Software Engineering ,</w:t>
+      </w:r>
+      <w:r>
+        <w:rPr>
+          <w:b/>
+          <w:bCs/>
+          <w:sz w:val="18"/>
+          <w:szCs w:val="18"/>
+        </w:rPr>
+        <w:t>Machine Learning ,Design Analysis &amp; Algorithms, Operating Systems, Software Development, Data Structures, Computer Organization,</w:t>
       </w:r>
       <w:r>
         <w:rPr>
@@ -836,25 +683,13 @@
         </w:rPr>
         <w:t xml:space="preserve">| DevOps Intern | </w:t>
       </w:r>
-      <w:proofErr w:type="spellStart"/>
-      <w:proofErr w:type="gramStart"/>
       <w:r>
         <w:rPr>
           <w:rFonts w:ascii="Times New Roman" w:hAnsi="Times New Roman" w:cs="Times New Roman"/>
           <w:sz w:val="18"/>
           <w:szCs w:val="18"/>
         </w:rPr>
-        <w:t>Atlanta,GA</w:t>
-      </w:r>
-      <w:proofErr w:type="spellEnd"/>
-      <w:proofErr w:type="gramEnd"/>
-      <w:r>
-        <w:rPr>
-          <w:rFonts w:ascii="Times New Roman" w:hAnsi="Times New Roman" w:cs="Times New Roman"/>
-          <w:sz w:val="18"/>
-          <w:szCs w:val="18"/>
-        </w:rPr>
-        <w:t xml:space="preserve">             July 2025 - Present</w:t>
+        <w:t>Atlanta,GA             July 2025 - Present</w:t>
       </w:r>
     </w:p>
     <w:p>
@@ -906,57 +741,7 @@
           <w:sz w:val="18"/>
           <w:szCs w:val="18"/>
         </w:rPr>
-        <w:t xml:space="preserve">Troubleshoot and resolve 50+ issues related to </w:t>
-      </w:r>
-      <w:proofErr w:type="spellStart"/>
-      <w:r>
-        <w:rPr>
-          <w:bCs/>
-          <w:color w:val="000000" w:themeColor="text1"/>
-          <w:sz w:val="18"/>
-          <w:szCs w:val="18"/>
-        </w:rPr>
-        <w:t>Slurm</w:t>
-      </w:r>
-      <w:proofErr w:type="spellEnd"/>
-      <w:r>
-        <w:rPr>
-          <w:bCs/>
-          <w:color w:val="000000" w:themeColor="text1"/>
-          <w:sz w:val="18"/>
-          <w:szCs w:val="18"/>
-        </w:rPr>
-        <w:t xml:space="preserve"> job scheduling, file access, storage quotas, and environment modules, improving job success rates and reducing wasted </w:t>
-      </w:r>
-      <w:proofErr w:type="gramStart"/>
-      <w:r>
-        <w:rPr>
-          <w:bCs/>
-          <w:color w:val="000000" w:themeColor="text1"/>
-          <w:sz w:val="18"/>
-          <w:szCs w:val="18"/>
-        </w:rPr>
-        <w:t>compute</w:t>
-      </w:r>
-      <w:proofErr w:type="gramEnd"/>
-      <w:r>
-        <w:rPr>
-          <w:bCs/>
-          <w:color w:val="000000" w:themeColor="text1"/>
-          <w:sz w:val="18"/>
-          <w:szCs w:val="18"/>
-        </w:rPr>
-        <w:t xml:space="preserve"> </w:t>
-      </w:r>
-      <w:proofErr w:type="gramStart"/>
-      <w:r>
-        <w:rPr>
-          <w:bCs/>
-          <w:color w:val="000000" w:themeColor="text1"/>
-          <w:sz w:val="18"/>
-          <w:szCs w:val="18"/>
-        </w:rPr>
-        <w:t>time.</w:t>
+        <w:t>Troubleshoot and resolve 50+ issues related to Slurm job scheduling, file access, storage quotas, and environment modules, improving job success rates and reducing wasted compute time.</w:t>
       </w:r>
       <w:r>
         <w:rPr>
@@ -967,7 +752,6 @@
         </w:rPr>
         <w:t>.</w:t>
       </w:r>
-      <w:proofErr w:type="gramEnd"/>
     </w:p>
     <w:p>
       <w:pPr>
@@ -1255,32 +1039,34 @@
           <w:tab w:val="right" w:pos="10800"/>
         </w:tabs>
         <w:rPr>
-          <w:color w:val="000000" w:themeColor="text1"/>
-          <w:sz w:val="18"/>
-          <w:szCs w:val="18"/>
-        </w:rPr>
-      </w:pPr>
-      <w:proofErr w:type="spellStart"/>
-      <w:r>
-        <w:rPr>
-          <w:b/>
-          <w:bCs/>
-          <w:color w:val="000000" w:themeColor="text1"/>
-          <w:sz w:val="18"/>
-          <w:szCs w:val="18"/>
-        </w:rPr>
-        <w:t>Stockd</w:t>
-      </w:r>
-      <w:proofErr w:type="spellEnd"/>
-      <w:r>
-        <w:rPr>
-          <w:b/>
-          <w:bCs/>
-          <w:color w:val="000000" w:themeColor="text1"/>
-          <w:sz w:val="18"/>
-          <w:szCs w:val="18"/>
-        </w:rPr>
-        <w:t xml:space="preserve"> — AI-Powered Inventory Management + Dynamic Pricing</w:t>
+          <w:b/>
+          <w:bCs/>
+          <w:color w:val="000000" w:themeColor="text1"/>
+          <w:sz w:val="18"/>
+          <w:szCs w:val="18"/>
+        </w:rPr>
+      </w:pPr>
+    </w:p>
+    <w:p>
+      <w:pPr>
+        <w:tabs>
+          <w:tab w:val="right" w:pos="10800"/>
+        </w:tabs>
+        <w:rPr>
+          <w:color w:val="000000" w:themeColor="text1"/>
+          <w:sz w:val="18"/>
+          <w:szCs w:val="18"/>
+        </w:rPr>
+      </w:pPr>
+      <w:r>
+        <w:rPr>
+          <w:b/>
+          <w:bCs/>
+          <w:color w:val="000000" w:themeColor="text1"/>
+          <w:sz w:val="18"/>
+          <w:szCs w:val="18"/>
+        </w:rPr>
+        <w:t>Stockd — AI-Powered Inventory Management + Dynamic Pricing</w:t>
       </w:r>
       <w:r>
         <w:rPr>
@@ -1317,23 +1103,39 @@
           <w:sz w:val="18"/>
           <w:szCs w:val="18"/>
         </w:rPr>
-        <w:t xml:space="preserve"> | UGAHACKS11: NCR VOYX Track</w:t>
-      </w:r>
-      <w:r>
-        <w:rPr>
-          <w:color w:val="000000" w:themeColor="text1"/>
-          <w:sz w:val="18"/>
-          <w:szCs w:val="18"/>
-        </w:rPr>
-        <w:t>|</w:t>
-      </w:r>
-      <w:r>
-        <w:rPr>
-          <w:color w:val="000000" w:themeColor="text1"/>
-          <w:sz w:val="18"/>
-          <w:szCs w:val="18"/>
-        </w:rPr>
-        <w:t xml:space="preserve"> Spring</w:t>
+        <w:t xml:space="preserve"> | UGAHACKS11: NCR VOYX Trac</w:t>
+      </w:r>
+      <w:r>
+        <w:rPr>
+          <w:color w:val="000000" w:themeColor="text1"/>
+          <w:sz w:val="18"/>
+          <w:szCs w:val="18"/>
+        </w:rPr>
+        <w:t>k</w:t>
+      </w:r>
+      <w:r>
+        <w:rPr>
+          <w:color w:val="000000" w:themeColor="text1"/>
+          <w:sz w:val="18"/>
+          <w:szCs w:val="18"/>
+        </w:rPr>
+        <w:t xml:space="preserve"> </w:t>
+      </w:r>
+      <w:r>
+        <w:rPr>
+          <w:color w:val="000000" w:themeColor="text1"/>
+          <w:sz w:val="18"/>
+          <w:szCs w:val="18"/>
+        </w:rPr>
+        <w:t xml:space="preserve">                            </w:t>
+      </w:r>
+      <w:r>
+        <w:rPr>
+          <w:color w:val="000000" w:themeColor="text1"/>
+          <w:sz w:val="18"/>
+          <w:szCs w:val="18"/>
+        </w:rPr>
+        <w:t>Spring</w:t>
       </w:r>
       <w:r>
         <w:rPr>
@@ -1400,61 +1202,7 @@
           <w:sz w:val="18"/>
           <w:szCs w:val="18"/>
         </w:rPr>
-        <w:t xml:space="preserve">Architected a fully serverless backend using PostgreSQL 17 and </w:t>
-      </w:r>
-      <w:proofErr w:type="spellStart"/>
-      <w:r>
-        <w:rPr>
-          <w:color w:val="000000" w:themeColor="text1"/>
-          <w:sz w:val="18"/>
-          <w:szCs w:val="18"/>
-        </w:rPr>
-        <w:t>Supabase</w:t>
-      </w:r>
-      <w:proofErr w:type="spellEnd"/>
-      <w:r>
-        <w:rPr>
-          <w:color w:val="000000" w:themeColor="text1"/>
-          <w:sz w:val="18"/>
-          <w:szCs w:val="18"/>
-        </w:rPr>
-        <w:t xml:space="preserve"> RPC, designing 15+ stored procedures (</w:t>
-      </w:r>
-      <w:proofErr w:type="spellStart"/>
-      <w:r>
-        <w:rPr>
-          <w:color w:val="000000" w:themeColor="text1"/>
-          <w:sz w:val="18"/>
-          <w:szCs w:val="18"/>
-        </w:rPr>
-        <w:t>plpgsql</w:t>
-      </w:r>
-      <w:proofErr w:type="spellEnd"/>
-      <w:r>
-        <w:rPr>
-          <w:color w:val="000000" w:themeColor="text1"/>
-          <w:sz w:val="18"/>
-          <w:szCs w:val="18"/>
-        </w:rPr>
-        <w:t xml:space="preserve">) as the entire API layer — including an atomic RPC that processes live POS orders in a single transaction, </w:t>
-      </w:r>
-      <w:proofErr w:type="spellStart"/>
-      <w:r>
-        <w:rPr>
-          <w:color w:val="000000" w:themeColor="text1"/>
-          <w:sz w:val="18"/>
-          <w:szCs w:val="18"/>
-        </w:rPr>
-        <w:t>upserting</w:t>
-      </w:r>
-      <w:proofErr w:type="spellEnd"/>
-      <w:r>
-        <w:rPr>
-          <w:color w:val="000000" w:themeColor="text1"/>
-          <w:sz w:val="18"/>
-          <w:szCs w:val="18"/>
-        </w:rPr>
-        <w:t xml:space="preserve"> sales, consuming ingredients via Bill of Materials joins, and decrementing inventory in real-time with zero race conditions.</w:t>
+        <w:t>Architected a fully serverless backend using PostgreSQL 17 and Supabase RPC, designing 15+ stored procedures (plpgsql) as the entire API layer — including an atomic RPC that processes live POS orders in a single transaction, upserting sales, consuming ingredients via Bill of Materials joins, and decrementing inventory in real-time with zero race conditions.</w:t>
       </w:r>
     </w:p>
     <w:p>
@@ -1513,28 +1261,98 @@
           <w:tab w:val="right" w:pos="10800"/>
         </w:tabs>
         <w:rPr>
-          <w:color w:val="000000" w:themeColor="text1"/>
-          <w:sz w:val="18"/>
-          <w:szCs w:val="18"/>
-        </w:rPr>
-      </w:pPr>
-      <w:r>
-        <w:rPr>
-          <w:b/>
-          <w:bCs/>
-          <w:color w:val="000000" w:themeColor="text1"/>
-          <w:sz w:val="18"/>
-          <w:szCs w:val="18"/>
-        </w:rPr>
-        <w:t xml:space="preserve">Speech Mate – AI-Powered Public Speaking Coach </w:t>
-      </w:r>
-      <w:r>
-        <w:rPr>
-          <w:color w:val="000000" w:themeColor="text1"/>
-          <w:sz w:val="18"/>
-          <w:szCs w:val="18"/>
-        </w:rPr>
-        <w:t xml:space="preserve">| AI-ATL Hackathon (Georgia Tech) | </w:t>
+          <w:b/>
+          <w:bCs/>
+          <w:color w:val="000000" w:themeColor="text1"/>
+          <w:sz w:val="18"/>
+          <w:szCs w:val="18"/>
+        </w:rPr>
+      </w:pPr>
+    </w:p>
+    <w:p>
+      <w:pPr>
+        <w:tabs>
+          <w:tab w:val="right" w:pos="10800"/>
+        </w:tabs>
+        <w:rPr>
+          <w:color w:val="000000" w:themeColor="text1"/>
+          <w:sz w:val="18"/>
+          <w:szCs w:val="18"/>
+        </w:rPr>
+      </w:pPr>
+      <w:r>
+        <w:rPr>
+          <w:b/>
+          <w:bCs/>
+          <w:color w:val="000000" w:themeColor="text1"/>
+          <w:sz w:val="18"/>
+          <w:szCs w:val="18"/>
+        </w:rPr>
+        <w:t>RoomieSyncA</w:t>
+      </w:r>
+      <w:r>
+        <w:rPr>
+          <w:b/>
+          <w:bCs/>
+          <w:color w:val="000000" w:themeColor="text1"/>
+          <w:sz w:val="18"/>
+          <w:szCs w:val="18"/>
+        </w:rPr>
+        <w:t>I</w:t>
+      </w:r>
+      <w:r>
+        <w:rPr>
+          <w:b/>
+          <w:bCs/>
+          <w:color w:val="000000" w:themeColor="text1"/>
+          <w:sz w:val="18"/>
+          <w:szCs w:val="18"/>
+        </w:rPr>
+        <w:t xml:space="preserve">– </w:t>
+      </w:r>
+      <w:r>
+        <w:rPr>
+          <w:b/>
+          <w:bCs/>
+          <w:color w:val="000000" w:themeColor="text1"/>
+          <w:sz w:val="18"/>
+          <w:szCs w:val="18"/>
+        </w:rPr>
+        <w:t>Roommate Mediation Platform</w:t>
+      </w:r>
+      <w:r>
+        <w:rPr>
+          <w:b/>
+          <w:bCs/>
+          <w:color w:val="000000" w:themeColor="text1"/>
+          <w:sz w:val="18"/>
+          <w:szCs w:val="18"/>
+        </w:rPr>
+        <w:t xml:space="preserve"> </w:t>
+      </w:r>
+      <w:r>
+        <w:rPr>
+          <w:color w:val="000000" w:themeColor="text1"/>
+          <w:sz w:val="18"/>
+          <w:szCs w:val="18"/>
+        </w:rPr>
+        <w:t xml:space="preserve">| </w:t>
+      </w:r>
+      <w:r>
+        <w:rPr>
+          <w:color w:val="000000" w:themeColor="text1"/>
+          <w:sz w:val="18"/>
+          <w:szCs w:val="18"/>
+        </w:rPr>
+        <w:t>Hacklanta</w:t>
+      </w:r>
+      <w:r>
+        <w:rPr>
+          <w:color w:val="000000" w:themeColor="text1"/>
+          <w:sz w:val="18"/>
+          <w:szCs w:val="18"/>
+        </w:rPr>
+        <w:tab/>
       </w:r>
       <w:r>
         <w:rPr>
@@ -1544,17 +1362,7 @@
           <w:sz w:val="18"/>
           <w:szCs w:val="18"/>
         </w:rPr>
-        <w:t>Fall</w:t>
-      </w:r>
-      <w:r>
-        <w:rPr>
-          <w:i/>
-          <w:iCs/>
-          <w:color w:val="000000" w:themeColor="text1"/>
-          <w:sz w:val="18"/>
-          <w:szCs w:val="18"/>
-        </w:rPr>
-        <w:t xml:space="preserve"> 2025</w:t>
+        <w:t>Spring 2026</w:t>
       </w:r>
     </w:p>
     <w:p>
@@ -1577,7 +1385,39 @@
             <w:sz w:val="18"/>
             <w:szCs w:val="18"/>
           </w:rPr>
-          <w:t>Link to Project</w:t>
+          <w:t>Link</w:t>
+        </w:r>
+        <w:r>
+          <w:rPr>
+            <w:rStyle w:val="Hyperlink"/>
+            <w:sz w:val="18"/>
+            <w:szCs w:val="18"/>
+          </w:rPr>
+          <w:t xml:space="preserve"> </w:t>
+        </w:r>
+        <w:r>
+          <w:rPr>
+            <w:rStyle w:val="Hyperlink"/>
+            <w:sz w:val="18"/>
+            <w:szCs w:val="18"/>
+          </w:rPr>
+          <w:t>to Pro</w:t>
+        </w:r>
+        <w:r>
+          <w:rPr>
+            <w:rStyle w:val="Hyperlink"/>
+            <w:sz w:val="18"/>
+            <w:szCs w:val="18"/>
+          </w:rPr>
+          <w:t>j</w:t>
+        </w:r>
+        <w:r>
+          <w:rPr>
+            <w:rStyle w:val="Hyperlink"/>
+            <w:sz w:val="18"/>
+            <w:szCs w:val="18"/>
+          </w:rPr>
+          <w:t>ect</w:t>
         </w:r>
       </w:hyperlink>
     </w:p>
@@ -1603,7 +1443,7 @@
           <w:sz w:val="18"/>
           <w:szCs w:val="18"/>
         </w:rPr>
-        <w:t>Built a full-stack app with a React + TypeScript + Vite frontend and a Java 21 / Spring Boot 3 backend, exposing REST APIs for speech generation, multimodal analysis, and text-to-speech.</w:t>
+        <w:t>Engineered the backend and core product logic for a university housing app that uses AI to mediate roommate issues through check-ins, concern intake, and generated communication workflows.</w:t>
       </w:r>
     </w:p>
     <w:p>
@@ -1628,43 +1468,7 @@
           <w:sz w:val="18"/>
           <w:szCs w:val="18"/>
         </w:rPr>
-        <w:t xml:space="preserve">Implemented Gemini-powered endpoints using Spring </w:t>
-      </w:r>
-      <w:proofErr w:type="spellStart"/>
-      <w:r>
-        <w:rPr>
-          <w:color w:val="000000" w:themeColor="text1"/>
-          <w:sz w:val="18"/>
-          <w:szCs w:val="18"/>
-        </w:rPr>
-        <w:t>WebFlux</w:t>
-      </w:r>
-      <w:proofErr w:type="spellEnd"/>
-      <w:r>
-        <w:rPr>
-          <w:color w:val="000000" w:themeColor="text1"/>
-          <w:sz w:val="18"/>
-          <w:szCs w:val="18"/>
-        </w:rPr>
-        <w:t xml:space="preserve"> (</w:t>
-      </w:r>
-      <w:proofErr w:type="spellStart"/>
-      <w:r>
-        <w:rPr>
-          <w:color w:val="000000" w:themeColor="text1"/>
-          <w:sz w:val="18"/>
-          <w:szCs w:val="18"/>
-        </w:rPr>
-        <w:t>WebClient</w:t>
-      </w:r>
-      <w:proofErr w:type="spellEnd"/>
-      <w:r>
-        <w:rPr>
-          <w:color w:val="000000" w:themeColor="text1"/>
-          <w:sz w:val="18"/>
-          <w:szCs w:val="18"/>
-        </w:rPr>
-        <w:t>) to handle video, slides, and notes uploads and return structured JSON with scores, filler word counts, and detailed feedback.</w:t>
+        <w:t>Built services for weekly response collection, room-level aggregation, and AI-generated summaries and outreach, turning unstructured roommate input into actionable, low-conflict outputs.</w:t>
       </w:r>
     </w:p>
     <w:p>
@@ -1689,32 +1493,7 @@
           <w:sz w:val="18"/>
           <w:szCs w:val="18"/>
         </w:rPr>
-        <w:t>Integrated Google OAuth 2.0 with Spring Security to secure user accounts and protect analysis and generation endpoints.</w:t>
-      </w:r>
-    </w:p>
-    <w:p>
-      <w:pPr>
-        <w:pStyle w:val="ListParagraph"/>
-        <w:numPr>
-          <w:ilvl w:val="0"/>
-          <w:numId w:val="1"/>
-        </w:numPr>
-        <w:tabs>
-          <w:tab w:val="right" w:pos="10800"/>
-        </w:tabs>
-        <w:rPr>
-          <w:color w:val="000000" w:themeColor="text1"/>
-          <w:sz w:val="18"/>
-          <w:szCs w:val="18"/>
-        </w:rPr>
-      </w:pPr>
-      <w:r>
-        <w:rPr>
-          <w:color w:val="000000" w:themeColor="text1"/>
-          <w:sz w:val="18"/>
-          <w:szCs w:val="18"/>
-        </w:rPr>
-        <w:t>Designed the React UI to display analysis reports, recommendations, and playback audio, creating a smooth practice workflow for users.</w:t>
+        <w:t>Delivered a functional end-to-end prototype under hackathon constraints by combining backend development, app flow design, and applied AI workflow integration.</w:t>
       </w:r>
     </w:p>
     <w:p>
@@ -1851,27 +1630,15 @@
           <w:tab w:val="right" w:pos="10800"/>
         </w:tabs>
       </w:pPr>
-      <w:proofErr w:type="spellStart"/>
-      <w:r>
-        <w:rPr>
-          <w:b/>
-          <w:bCs/>
-          <w:color w:val="000000" w:themeColor="text1"/>
-          <w:sz w:val="18"/>
-          <w:szCs w:val="18"/>
-        </w:rPr>
-        <w:t>LeetCode</w:t>
-      </w:r>
-      <w:proofErr w:type="spellEnd"/>
-      <w:r>
-        <w:rPr>
-          <w:b/>
-          <w:bCs/>
-          <w:color w:val="000000" w:themeColor="text1"/>
-          <w:sz w:val="18"/>
-          <w:szCs w:val="18"/>
-        </w:rPr>
-        <w:t xml:space="preserve"> | Active Participant | 2024 – Present</w:t>
+      <w:r>
+        <w:rPr>
+          <w:b/>
+          <w:bCs/>
+          <w:color w:val="000000" w:themeColor="text1"/>
+          <w:sz w:val="18"/>
+          <w:szCs w:val="18"/>
+        </w:rPr>
+        <w:t>LeetCode | Active Participant | 2024 – Present</w:t>
       </w:r>
     </w:p>
     <w:p>
@@ -3686,20 +3453,20 @@
 </file>
 
 <file path=customXml/item1.xml><?xml version="1.0" encoding="utf-8"?>
+<p:properties xmlns:p="http://schemas.microsoft.com/office/2006/metadata/properties" xmlns:xsi="http://www.w3.org/2001/XMLSchema-instance" xmlns:pc="http://schemas.microsoft.com/office/infopath/2007/PartnerControls">
+  <documentManagement>
+    <_activity xmlns="405f6bdb-d96e-4b8a-a0aa-1805033a2888" xsi:nil="true"/>
+  </documentManagement>
+</p:properties>
+</file>
+
+<file path=customXml/item2.xml><?xml version="1.0" encoding="utf-8"?>
 <?mso-contentType ?>
 <FormTemplates xmlns="http://schemas.microsoft.com/sharepoint/v3/contenttype/forms">
   <Display>DocumentLibraryForm</Display>
   <Edit>DocumentLibraryForm</Edit>
   <New>DocumentLibraryForm</New>
 </FormTemplates>
-</file>
-
-<file path=customXml/item2.xml><?xml version="1.0" encoding="utf-8"?>
-<p:properties xmlns:p="http://schemas.microsoft.com/office/2006/metadata/properties" xmlns:xsi="http://www.w3.org/2001/XMLSchema-instance" xmlns:pc="http://schemas.microsoft.com/office/infopath/2007/PartnerControls">
-  <documentManagement>
-    <_activity xmlns="405f6bdb-d96e-4b8a-a0aa-1805033a2888" xsi:nil="true"/>
-  </documentManagement>
-</p:properties>
 </file>
 
 <file path=customXml/item3.xml><?xml version="1.0" encoding="utf-8"?>
@@ -3936,19 +3703,19 @@
 </file>
 
 <file path=customXml/itemProps1.xml><?xml version="1.0" encoding="utf-8"?>
-<ds:datastoreItem xmlns:ds="http://schemas.openxmlformats.org/officeDocument/2006/customXml" ds:itemID="{613A3ED9-5A2F-4E90-8063-CE12E7021299}">
+<ds:datastoreItem xmlns:ds="http://schemas.openxmlformats.org/officeDocument/2006/customXml" ds:itemID="{48BBE56C-A8CC-4231-98AE-576D54326F67}">
   <ds:schemaRefs>
-    <ds:schemaRef ds:uri="http://schemas.microsoft.com/sharepoint/v3/contenttype/forms"/>
+    <ds:schemaRef ds:uri="http://schemas.microsoft.com/office/2006/metadata/properties"/>
+    <ds:schemaRef ds:uri="http://schemas.microsoft.com/office/infopath/2007/PartnerControls"/>
+    <ds:schemaRef ds:uri="405f6bdb-d96e-4b8a-a0aa-1805033a2888"/>
   </ds:schemaRefs>
 </ds:datastoreItem>
 </file>
 
 <file path=customXml/itemProps2.xml><?xml version="1.0" encoding="utf-8"?>
-<ds:datastoreItem xmlns:ds="http://schemas.openxmlformats.org/officeDocument/2006/customXml" ds:itemID="{48BBE56C-A8CC-4231-98AE-576D54326F67}">
+<ds:datastoreItem xmlns:ds="http://schemas.openxmlformats.org/officeDocument/2006/customXml" ds:itemID="{613A3ED9-5A2F-4E90-8063-CE12E7021299}">
   <ds:schemaRefs>
-    <ds:schemaRef ds:uri="http://schemas.microsoft.com/office/2006/metadata/properties"/>
-    <ds:schemaRef ds:uri="http://schemas.microsoft.com/office/infopath/2007/PartnerControls"/>
-    <ds:schemaRef ds:uri="405f6bdb-d96e-4b8a-a0aa-1805033a2888"/>
+    <ds:schemaRef ds:uri="http://schemas.microsoft.com/sharepoint/v3/contenttype/forms"/>
   </ds:schemaRefs>
 </ds:datastoreItem>
 </file>

</xml_diff>